<commit_message>
change To Do List
</commit_message>
<xml_diff>
--- a/documentation/Web Project 2.docx
+++ b/documentation/Web Project 2.docx
@@ -3,36 +3,12 @@
 <w:document xmlns:wpc="http://schemas.microsoft.com/office/word/2010/wordprocessingCanvas" xmlns:cx="http://schemas.microsoft.com/office/drawing/2014/chartex" xmlns:cx1="http://schemas.microsoft.com/office/drawing/2015/9/8/chartex" xmlns:cx2="http://schemas.microsoft.com/office/drawing/2015/10/21/chartex" xmlns:cx3="http://schemas.microsoft.com/office/drawing/2016/5/9/chartex" xmlns:cx4="http://schemas.microsoft.com/office/drawing/2016/5/10/chartex" xmlns:cx5="http://schemas.microsoft.com/office/drawing/2016/5/11/chartex" xmlns:cx6="http://schemas.microsoft.com/office/drawing/2016/5/12/chartex" xmlns:cx7="http://schemas.microsoft.com/office/drawing/2016/5/13/chartex" xmlns:cx8="http://schemas.microsoft.com/office/drawing/2016/5/14/chartex" xmlns:mc="http://schemas.openxmlformats.org/markup-compatibility/2006" xmlns:m="http://schemas.openxmlformats.org/officeDocument/2006/math" xmlns:aink="http://schemas.microsoft.com/office/drawing/2016/ink" xmlns:am3d="http://schemas.microsoft.com/office/drawing/2017/model3d" xmlns:oel="http://schemas.microsoft.com/office/2019/extlst" xmlns:r="http://schemas.openxmlformats.org/officeDocument/2006/relationships" xmlns:wp14="http://schemas.microsoft.com/office/word/2010/wordprocessingDrawing" xmlns:wp="http://schemas.openxmlformats.org/drawingml/2006/wordprocessingDrawing" xmlns:wpg="http://schemas.microsoft.com/office/word/2010/wordprocessingGroup" xmlns:wpi="http://schemas.microsoft.com/office/word/2010/wordprocessingInk" xmlns:wps="http://schemas.microsoft.com/office/word/2010/wordprocessingShape" xmlns:o="urn:schemas-microsoft-com:office:office" xmlns:v="urn:schemas-microsoft-com:vml" xmlns:w10="urn:schemas-microsoft-com:office:word" xmlns:w="http://schemas.openxmlformats.org/wordprocessingml/2006/main" xmlns:w14="http://schemas.microsoft.com/office/word/2010/wordml" xmlns:w15="http://schemas.microsoft.com/office/word/2012/wordml" xmlns:w16cex="http://schemas.microsoft.com/office/word/2018/wordml/cex" xmlns:w16cid="http://schemas.microsoft.com/office/word/2016/wordml/cid" xmlns:w16="http://schemas.microsoft.com/office/word/2018/wordml" xmlns:w16sdtdh="http://schemas.microsoft.com/office/word/2020/wordml/sdtdatahash" xmlns:w16sdtfl="http://schemas.microsoft.com/office/word/2024/wordml/sdtformatlock" xmlns:w16se="http://schemas.microsoft.com/office/word/2015/wordml/symex" xmlns:w16du="http://schemas.microsoft.com/office/word/2023/wordml/word16du" xmlns:wne="http://schemas.microsoft.com/office/word/2006/wordml" mc:Ignorable="w14 w15 w16se w16cid w16 w16cex w16sdtdh w16sdtfl w16du wp14">
   <w:body>
     <w:p>
-      <w:pPr>
-        <w:rPr>
-          <w:lang w:val="de-DE"/>
-        </w:rPr>
-      </w:pPr>
-      <w:proofErr w:type="gramStart"/>
-      <w:r>
-        <w:rPr>
-          <w:lang w:val="de-DE"/>
-        </w:rPr>
-        <w:t>Web Project</w:t>
-      </w:r>
-      <w:proofErr w:type="gramEnd"/>
-      <w:r>
-        <w:rPr>
-          <w:lang w:val="de-DE"/>
-        </w:rPr>
-        <w:t xml:space="preserve"> 2</w:t>
-      </w:r>
-    </w:p>
-    <w:p>
-      <w:pPr>
-        <w:rPr>
-          <w:lang w:val="de-DE"/>
-        </w:rPr>
-      </w:pPr>
-      <w:r>
-        <w:rPr>
-          <w:lang w:val="de-DE"/>
-        </w:rPr>
+      <w:r>
+        <w:t>Web Project 2</w:t>
+      </w:r>
+    </w:p>
+    <w:p>
+      <w:r>
         <w:t xml:space="preserve">Front-end </w:t>
       </w:r>
     </w:p>
@@ -41,14 +17,12 @@
         <w:rPr>
           <w:sz w:val="18"/>
           <w:szCs w:val="20"/>
-          <w:lang w:val="de-DE"/>
-        </w:rPr>
-      </w:pPr>
-      <w:r>
-        <w:rPr>
-          <w:sz w:val="18"/>
-          <w:szCs w:val="20"/>
-          <w:lang w:val="de-DE"/>
+        </w:rPr>
+      </w:pPr>
+      <w:r>
+        <w:rPr>
+          <w:sz w:val="18"/>
+          <w:szCs w:val="20"/>
         </w:rPr>
         <w:t xml:space="preserve">Pages: </w:t>
       </w:r>
@@ -866,7 +840,6 @@
       <w:pPr>
         <w:bidi/>
         <w:rPr>
-          <w:rFonts w:hint="cs"/>
           <w:sz w:val="18"/>
           <w:szCs w:val="20"/>
           <w:rtl/>
@@ -880,6 +853,861 @@
           <w:lang w:val="de-DE"/>
         </w:rPr>
       </w:pPr>
+      <w:proofErr w:type="spellStart"/>
+      <w:r>
+        <w:rPr>
+          <w:lang w:val="de-DE"/>
+        </w:rPr>
+        <w:t>What</w:t>
+      </w:r>
+      <w:proofErr w:type="spellEnd"/>
+      <w:r>
+        <w:rPr>
+          <w:lang w:val="de-DE"/>
+        </w:rPr>
+        <w:t xml:space="preserve"> </w:t>
+      </w:r>
+      <w:proofErr w:type="spellStart"/>
+      <w:r>
+        <w:rPr>
+          <w:lang w:val="de-DE"/>
+        </w:rPr>
+        <w:t>is</w:t>
+      </w:r>
+      <w:proofErr w:type="spellEnd"/>
+      <w:r>
+        <w:rPr>
+          <w:lang w:val="de-DE"/>
+        </w:rPr>
+        <w:t xml:space="preserve"> </w:t>
+      </w:r>
+      <w:proofErr w:type="spellStart"/>
+      <w:r>
+        <w:rPr>
+          <w:lang w:val="de-DE"/>
+        </w:rPr>
+        <w:t>done</w:t>
+      </w:r>
+      <w:proofErr w:type="spellEnd"/>
+      <w:r>
+        <w:rPr>
+          <w:lang w:val="de-DE"/>
+        </w:rPr>
+        <w:t>:</w:t>
+      </w:r>
+    </w:p>
+    <w:p>
+      <w:pPr>
+        <w:pStyle w:val="ListParagraph"/>
+        <w:numPr>
+          <w:ilvl w:val="0"/>
+          <w:numId w:val="9"/>
+        </w:numPr>
+        <w:rPr>
+          <w:lang w:val="de-DE"/>
+        </w:rPr>
+      </w:pPr>
+      <w:r>
+        <w:rPr>
+          <w:lang w:val="de-DE"/>
+        </w:rPr>
+        <w:t>front-end:</w:t>
+      </w:r>
+    </w:p>
+    <w:p>
+      <w:pPr>
+        <w:pStyle w:val="ListParagraph"/>
+        <w:numPr>
+          <w:ilvl w:val="1"/>
+          <w:numId w:val="9"/>
+        </w:numPr>
+      </w:pPr>
+      <w:r>
+        <w:t xml:space="preserve">implemented home, contact-about us, </w:t>
+      </w:r>
+      <w:r>
+        <w:t>user profile, café-</w:t>
+      </w:r>
+      <w:proofErr w:type="spellStart"/>
+      <w:r>
+        <w:t>ditails</w:t>
+      </w:r>
+      <w:proofErr w:type="spellEnd"/>
+      <w:r>
+        <w:t xml:space="preserve">, login-register, search-result </w:t>
+      </w:r>
+      <w:proofErr w:type="spellStart"/>
+      <w:r>
+        <w:t>poge</w:t>
+      </w:r>
+      <w:proofErr w:type="spellEnd"/>
+    </w:p>
+    <w:p>
+      <w:pPr>
+        <w:pStyle w:val="ListParagraph"/>
+        <w:numPr>
+          <w:ilvl w:val="1"/>
+          <w:numId w:val="9"/>
+        </w:numPr>
+      </w:pPr>
+      <w:r>
+        <w:t>designed the pages</w:t>
+      </w:r>
+    </w:p>
+    <w:p>
+      <w:pPr>
+        <w:pStyle w:val="ListParagraph"/>
+        <w:numPr>
+          <w:ilvl w:val="1"/>
+          <w:numId w:val="9"/>
+        </w:numPr>
+      </w:pPr>
+      <w:r>
+        <w:t>add café form</w:t>
+      </w:r>
+    </w:p>
+    <w:p/>
+    <w:p>
+      <w:pPr>
+        <w:pStyle w:val="ListParagraph"/>
+        <w:numPr>
+          <w:ilvl w:val="0"/>
+          <w:numId w:val="9"/>
+        </w:numPr>
+        <w:rPr>
+          <w:lang w:val="de-DE"/>
+        </w:rPr>
+      </w:pPr>
+      <w:r>
+        <w:rPr>
+          <w:lang w:val="de-DE" w:bidi="fa-IR"/>
+        </w:rPr>
+        <w:lastRenderedPageBreak/>
+        <w:t>back-end:</w:t>
+      </w:r>
+    </w:p>
+    <w:p>
+      <w:pPr>
+        <w:pStyle w:val="ListParagraph"/>
+        <w:numPr>
+          <w:ilvl w:val="1"/>
+          <w:numId w:val="9"/>
+        </w:numPr>
+      </w:pPr>
+      <w:r>
+        <w:rPr>
+          <w:lang w:bidi="fa-IR"/>
+        </w:rPr>
+        <w:t xml:space="preserve">developed the core Cafe CRUD on </w:t>
+      </w:r>
+      <w:r>
+        <w:rPr>
+          <w:lang w:bidi="fa-IR"/>
+        </w:rPr>
+        <w:t>the server</w:t>
+      </w:r>
+    </w:p>
+    <w:p>
+      <w:pPr>
+        <w:pStyle w:val="ListParagraph"/>
+        <w:numPr>
+          <w:ilvl w:val="1"/>
+          <w:numId w:val="9"/>
+        </w:numPr>
+      </w:pPr>
+      <w:r>
+        <w:rPr>
+          <w:lang w:bidi="fa-IR"/>
+        </w:rPr>
+        <w:t>implemented login-register-logout</w:t>
+      </w:r>
+    </w:p>
+    <w:p>
+      <w:pPr>
+        <w:pStyle w:val="ListParagraph"/>
+        <w:numPr>
+          <w:ilvl w:val="1"/>
+          <w:numId w:val="9"/>
+        </w:numPr>
+      </w:pPr>
+      <w:r>
+        <w:rPr>
+          <w:lang w:bidi="fa-IR"/>
+        </w:rPr>
+        <w:t>implemented authentication(</w:t>
+      </w:r>
+      <w:proofErr w:type="spellStart"/>
+      <w:proofErr w:type="gramStart"/>
+      <w:r>
+        <w:rPr>
+          <w:lang w:bidi="fa-IR"/>
+        </w:rPr>
+        <w:t>commnets</w:t>
+      </w:r>
+      <w:proofErr w:type="spellEnd"/>
+      <w:r>
+        <w:rPr>
+          <w:lang w:bidi="fa-IR"/>
+        </w:rPr>
+        <w:t>, ..</w:t>
+      </w:r>
+      <w:proofErr w:type="gramEnd"/>
+      <w:r>
+        <w:rPr>
+          <w:lang w:bidi="fa-IR"/>
+        </w:rPr>
+        <w:t>)</w:t>
+      </w:r>
+    </w:p>
+    <w:p>
+      <w:pPr>
+        <w:pStyle w:val="ListParagraph"/>
+        <w:numPr>
+          <w:ilvl w:val="1"/>
+          <w:numId w:val="9"/>
+        </w:numPr>
+      </w:pPr>
+      <w:r>
+        <w:rPr>
+          <w:lang w:bidi="fa-IR"/>
+        </w:rPr>
+        <w:t>implemented the schema</w:t>
+      </w:r>
+    </w:p>
+    <w:p>
+      <w:pPr>
+        <w:pStyle w:val="ListParagraph"/>
+        <w:numPr>
+          <w:ilvl w:val="1"/>
+          <w:numId w:val="9"/>
+        </w:numPr>
+      </w:pPr>
+      <w:r>
+        <w:rPr>
+          <w:lang w:bidi="fa-IR"/>
+        </w:rPr>
+        <w:t xml:space="preserve">implemented the edit </w:t>
+      </w:r>
+      <w:proofErr w:type="gramStart"/>
+      <w:r>
+        <w:rPr>
+          <w:lang w:bidi="fa-IR"/>
+        </w:rPr>
+        <w:t>users</w:t>
+      </w:r>
+      <w:proofErr w:type="gramEnd"/>
+      <w:r>
+        <w:rPr>
+          <w:lang w:bidi="fa-IR"/>
+        </w:rPr>
+        <w:t xml:space="preserve"> information</w:t>
+      </w:r>
+    </w:p>
+    <w:p>
+      <w:pPr>
+        <w:pStyle w:val="ListParagraph"/>
+        <w:numPr>
+          <w:ilvl w:val="1"/>
+          <w:numId w:val="9"/>
+        </w:numPr>
+      </w:pPr>
+    </w:p>
+    <w:p/>
+    <w:p>
+      <w:r>
+        <w:t>what is left?</w:t>
+      </w:r>
+    </w:p>
+    <w:p>
+      <w:pPr>
+        <w:pStyle w:val="ListParagraph"/>
+        <w:numPr>
+          <w:ilvl w:val="0"/>
+          <w:numId w:val="10"/>
+        </w:numPr>
+      </w:pPr>
+      <w:r>
+        <w:t>Backend:</w:t>
+      </w:r>
+    </w:p>
+    <w:p>
+      <w:pPr>
+        <w:pStyle w:val="ListParagraph"/>
+        <w:numPr>
+          <w:ilvl w:val="1"/>
+          <w:numId w:val="10"/>
+        </w:numPr>
+      </w:pPr>
+      <w:r>
+        <w:t>Reviews CRUD</w:t>
+      </w:r>
+      <w:r>
+        <w:t xml:space="preserve"> - &gt; Henrique</w:t>
+      </w:r>
+    </w:p>
+    <w:p>
+      <w:pPr>
+        <w:pStyle w:val="ListParagraph"/>
+        <w:numPr>
+          <w:ilvl w:val="1"/>
+          <w:numId w:val="10"/>
+        </w:numPr>
+      </w:pPr>
+      <w:r>
+        <w:t>Filters the cafes (by tags and cities)</w:t>
+      </w:r>
+      <w:r>
+        <w:t xml:space="preserve"> -&gt; Henrique</w:t>
+      </w:r>
+    </w:p>
+    <w:p>
+      <w:pPr>
+        <w:pStyle w:val="ListParagraph"/>
+        <w:numPr>
+          <w:ilvl w:val="1"/>
+          <w:numId w:val="10"/>
+        </w:numPr>
+      </w:pPr>
+      <w:r>
+        <w:t>Recently added</w:t>
+      </w:r>
+      <w:r>
+        <w:t xml:space="preserve"> cafes higher than 4</w:t>
+      </w:r>
+      <w:r>
+        <w:t>.5</w:t>
+      </w:r>
+      <w:r>
+        <w:t>(change the datatype)</w:t>
+      </w:r>
+      <w:r>
+        <w:t xml:space="preserve"> </w:t>
+      </w:r>
+      <w:r>
+        <w:rPr>
+          <w:lang w:bidi="fa-IR"/>
+        </w:rPr>
+        <w:t>+</w:t>
+      </w:r>
+      <w:r>
+        <w:rPr>
+          <w:lang w:bidi="fa-IR"/>
+        </w:rPr>
+        <w:t xml:space="preserve"> count the rates for avg rate</w:t>
+      </w:r>
+      <w:r>
+        <w:rPr>
+          <w:lang w:bidi="fa-IR"/>
+        </w:rPr>
+        <w:t xml:space="preserve"> -&gt; Henrique</w:t>
+      </w:r>
+    </w:p>
+    <w:p>
+      <w:pPr>
+        <w:pStyle w:val="ListParagraph"/>
+        <w:numPr>
+          <w:ilvl w:val="1"/>
+          <w:numId w:val="10"/>
+        </w:numPr>
+      </w:pPr>
+      <w:r>
+        <w:t>Implement the favorite cafes</w:t>
+      </w:r>
+      <w:r>
+        <w:t xml:space="preserve"> -&gt; Taha</w:t>
+      </w:r>
+    </w:p>
+    <w:p>
+      <w:pPr>
+        <w:pStyle w:val="ListParagraph"/>
+        <w:numPr>
+          <w:ilvl w:val="1"/>
+          <w:numId w:val="10"/>
+        </w:numPr>
+        <w:rPr>
+          <w:strike/>
+        </w:rPr>
+      </w:pPr>
+      <w:r>
+        <w:rPr>
+          <w:strike/>
+        </w:rPr>
+        <w:t>Implement added cafes</w:t>
+      </w:r>
+      <w:r>
+        <w:rPr>
+          <w:strike/>
+        </w:rPr>
+        <w:t xml:space="preserve"> </w:t>
+      </w:r>
+    </w:p>
+    <w:p>
+      <w:pPr>
+        <w:pStyle w:val="ListParagraph"/>
+        <w:numPr>
+          <w:ilvl w:val="1"/>
+          <w:numId w:val="10"/>
+        </w:numPr>
+      </w:pPr>
+      <w:r>
+        <w:t>Add user profile image</w:t>
+      </w:r>
+    </w:p>
+    <w:p>
+      <w:pPr>
+        <w:pStyle w:val="ListParagraph"/>
+        <w:numPr>
+          <w:ilvl w:val="1"/>
+          <w:numId w:val="10"/>
+        </w:numPr>
+      </w:pPr>
+      <w:r>
+        <w:t>*</w:t>
+      </w:r>
+      <w:proofErr w:type="gramStart"/>
+      <w:r>
+        <w:t>pictures</w:t>
+      </w:r>
+      <w:proofErr w:type="gramEnd"/>
+      <w:r>
+        <w:t xml:space="preserve"> of </w:t>
+      </w:r>
+      <w:proofErr w:type="gramStart"/>
+      <w:r>
+        <w:t>café(</w:t>
+      </w:r>
+      <w:proofErr w:type="gramEnd"/>
+      <w:r>
+        <w:t>the is created + others)</w:t>
+      </w:r>
+    </w:p>
+    <w:p>
+      <w:pPr>
+        <w:pStyle w:val="ListParagraph"/>
+        <w:numPr>
+          <w:ilvl w:val="0"/>
+          <w:numId w:val="10"/>
+        </w:numPr>
+      </w:pPr>
+      <w:r>
+        <w:rPr>
+          <w:lang w:val="de-DE" w:bidi="fa-IR"/>
+        </w:rPr>
+        <w:t>Frontend:</w:t>
+      </w:r>
+    </w:p>
+    <w:p>
+      <w:pPr>
+        <w:pStyle w:val="ListParagraph"/>
+        <w:numPr>
+          <w:ilvl w:val="1"/>
+          <w:numId w:val="10"/>
+        </w:numPr>
+      </w:pPr>
+      <w:r>
+        <w:t>Edit the range of rating to float</w:t>
+      </w:r>
+      <w:r>
+        <w:t xml:space="preserve"> -&gt; Dina</w:t>
+      </w:r>
+    </w:p>
+    <w:p>
+      <w:pPr>
+        <w:pStyle w:val="ListParagraph"/>
+        <w:numPr>
+          <w:ilvl w:val="1"/>
+          <w:numId w:val="10"/>
+        </w:numPr>
+      </w:pPr>
+      <w:r>
+        <w:t>Add some pictures</w:t>
+      </w:r>
+      <w:r>
+        <w:t xml:space="preserve"> -&gt; Dina</w:t>
+      </w:r>
+    </w:p>
+    <w:p>
+      <w:pPr>
+        <w:pStyle w:val="ListParagraph"/>
+        <w:numPr>
+          <w:ilvl w:val="1"/>
+          <w:numId w:val="10"/>
+        </w:numPr>
+      </w:pPr>
+      <w:r>
+        <w:t>Add confirm password to register</w:t>
+      </w:r>
+      <w:r>
+        <w:t xml:space="preserve"> -&gt; </w:t>
+      </w:r>
+      <w:r>
+        <w:t>Taha</w:t>
+      </w:r>
+    </w:p>
+    <w:p>
+      <w:pPr>
+        <w:pStyle w:val="ListParagraph"/>
+        <w:numPr>
+          <w:ilvl w:val="1"/>
+          <w:numId w:val="10"/>
+        </w:numPr>
+      </w:pPr>
+      <w:r>
+        <w:t>Forgot password form</w:t>
+      </w:r>
+      <w:r>
+        <w:t xml:space="preserve"> -&gt; Dina</w:t>
+      </w:r>
+    </w:p>
+    <w:p>
+      <w:pPr>
+        <w:pStyle w:val="ListParagraph"/>
+        <w:numPr>
+          <w:ilvl w:val="1"/>
+          <w:numId w:val="10"/>
+        </w:numPr>
+      </w:pPr>
+      <w:r>
+        <w:rPr>
+          <w:lang w:bidi="fa-IR"/>
+        </w:rPr>
+        <w:t xml:space="preserve">Add </w:t>
+      </w:r>
+      <w:r>
+        <w:rPr>
+          <w:lang w:bidi="fa-IR"/>
+        </w:rPr>
+        <w:t xml:space="preserve">a </w:t>
+      </w:r>
+      <w:proofErr w:type="spellStart"/>
+      <w:r>
+        <w:rPr>
+          <w:lang w:bidi="fa-IR"/>
+        </w:rPr>
+        <w:t>botton</w:t>
+      </w:r>
+      <w:proofErr w:type="spellEnd"/>
+      <w:r>
+        <w:rPr>
+          <w:lang w:bidi="fa-IR"/>
+        </w:rPr>
+        <w:t xml:space="preserve"> to </w:t>
+      </w:r>
+      <w:r>
+        <w:rPr>
+          <w:lang w:bidi="fa-IR"/>
+        </w:rPr>
+        <w:t xml:space="preserve">share </w:t>
+      </w:r>
+      <w:r>
+        <w:rPr>
+          <w:lang w:bidi="fa-IR"/>
+        </w:rPr>
+        <w:t xml:space="preserve">on </w:t>
+      </w:r>
+      <w:r>
+        <w:rPr>
+          <w:lang w:bidi="fa-IR"/>
+        </w:rPr>
+        <w:t xml:space="preserve">social media </w:t>
+      </w:r>
+      <w:r>
+        <w:rPr>
+          <w:lang w:bidi="fa-IR"/>
+        </w:rPr>
+        <w:t>-&gt; Taha</w:t>
+      </w:r>
+    </w:p>
+    <w:p>
+      <w:pPr>
+        <w:pStyle w:val="ListParagraph"/>
+        <w:numPr>
+          <w:ilvl w:val="1"/>
+          <w:numId w:val="10"/>
+        </w:numPr>
+      </w:pPr>
+      <w:r>
+        <w:rPr>
+          <w:lang w:bidi="fa-IR"/>
+        </w:rPr>
+        <w:t>Change</w:t>
+      </w:r>
+      <w:r>
+        <w:rPr>
+          <w:lang w:bidi="fa-IR"/>
+        </w:rPr>
+        <w:t xml:space="preserve"> recommended cafes to recently added</w:t>
+      </w:r>
+      <w:r>
+        <w:rPr>
+          <w:lang w:bidi="fa-IR"/>
+        </w:rPr>
+        <w:t>(name) -&gt; Dina</w:t>
+      </w:r>
+    </w:p>
+    <w:p>
+      <w:pPr>
+        <w:pStyle w:val="ListParagraph"/>
+        <w:numPr>
+          <w:ilvl w:val="1"/>
+          <w:numId w:val="10"/>
+        </w:numPr>
+      </w:pPr>
+      <w:r>
+        <w:rPr>
+          <w:lang w:bidi="fa-IR"/>
+        </w:rPr>
+        <w:t>Remove sorting</w:t>
+      </w:r>
+      <w:r>
+        <w:rPr>
+          <w:lang w:bidi="fa-IR"/>
+        </w:rPr>
+        <w:t xml:space="preserve"> -&gt; Dina</w:t>
+      </w:r>
+    </w:p>
+    <w:p>
+      <w:pPr>
+        <w:pStyle w:val="ListParagraph"/>
+        <w:numPr>
+          <w:ilvl w:val="1"/>
+          <w:numId w:val="10"/>
+        </w:numPr>
+      </w:pPr>
+      <w:r>
+        <w:rPr>
+          <w:lang w:bidi="fa-IR"/>
+        </w:rPr>
+        <w:t>Check responsive</w:t>
+      </w:r>
+      <w:r>
+        <w:rPr>
+          <w:lang w:bidi="fa-IR"/>
+        </w:rPr>
+        <w:t xml:space="preserve"> -&gt; Dina</w:t>
+      </w:r>
+    </w:p>
+    <w:p>
+      <w:pPr>
+        <w:pStyle w:val="ListParagraph"/>
+        <w:numPr>
+          <w:ilvl w:val="1"/>
+          <w:numId w:val="10"/>
+        </w:numPr>
+      </w:pPr>
+      <w:r>
+        <w:rPr>
+          <w:lang w:bidi="fa-IR"/>
+        </w:rPr>
+        <w:t xml:space="preserve">Add Dresden, </w:t>
+      </w:r>
+      <w:r>
+        <w:rPr>
+          <w:lang w:bidi="fa-IR"/>
+        </w:rPr>
+        <w:t>Konstanz</w:t>
+      </w:r>
+      <w:r>
+        <w:rPr>
+          <w:lang w:bidi="fa-IR"/>
+        </w:rPr>
+        <w:t xml:space="preserve"> </w:t>
+      </w:r>
+      <w:r>
+        <w:rPr>
+          <w:lang w:bidi="fa-IR"/>
+        </w:rPr>
+        <w:t xml:space="preserve">(templates in the home </w:t>
+      </w:r>
+      <w:proofErr w:type="gramStart"/>
+      <w:r>
+        <w:rPr>
+          <w:lang w:bidi="fa-IR"/>
+        </w:rPr>
+        <w:t xml:space="preserve">page) </w:t>
+      </w:r>
+      <w:r>
+        <w:rPr>
+          <w:lang w:bidi="fa-IR"/>
+        </w:rPr>
+        <w:t xml:space="preserve"> -</w:t>
+      </w:r>
+      <w:proofErr w:type="gramEnd"/>
+      <w:r>
+        <w:rPr>
+          <w:lang w:bidi="fa-IR"/>
+        </w:rPr>
+        <w:t>&gt; Taha</w:t>
+      </w:r>
+    </w:p>
+    <w:p>
+      <w:pPr>
+        <w:pStyle w:val="ListParagraph"/>
+        <w:numPr>
+          <w:ilvl w:val="1"/>
+          <w:numId w:val="10"/>
+        </w:numPr>
+      </w:pPr>
+      <w:r>
+        <w:rPr>
+          <w:lang w:bidi="fa-IR"/>
+        </w:rPr>
+        <w:t xml:space="preserve">Add two more recently added </w:t>
+      </w:r>
+      <w:proofErr w:type="gramStart"/>
+      <w:r>
+        <w:rPr>
+          <w:lang w:bidi="fa-IR"/>
+        </w:rPr>
+        <w:t>cafes</w:t>
+      </w:r>
+      <w:r>
+        <w:rPr>
+          <w:lang w:bidi="fa-IR"/>
+        </w:rPr>
+        <w:t>(</w:t>
+      </w:r>
+      <w:proofErr w:type="gramEnd"/>
+      <w:r>
+        <w:rPr>
+          <w:lang w:bidi="fa-IR"/>
+        </w:rPr>
+        <w:t>templates in the home page) -&gt; Dina</w:t>
+      </w:r>
+    </w:p>
+    <w:p>
+      <w:pPr>
+        <w:pStyle w:val="ListParagraph"/>
+        <w:numPr>
+          <w:ilvl w:val="1"/>
+          <w:numId w:val="10"/>
+        </w:numPr>
+      </w:pPr>
+      <w:r>
+        <w:rPr>
+          <w:lang w:bidi="fa-IR"/>
+        </w:rPr>
+        <w:t xml:space="preserve">Remove map </w:t>
+      </w:r>
+      <w:proofErr w:type="spellStart"/>
+      <w:r>
+        <w:rPr>
+          <w:lang w:bidi="fa-IR"/>
+        </w:rPr>
+        <w:t>botton</w:t>
+      </w:r>
+      <w:proofErr w:type="spellEnd"/>
+      <w:r>
+        <w:rPr>
+          <w:lang w:bidi="fa-IR"/>
+        </w:rPr>
+        <w:t xml:space="preserve"> in search div</w:t>
+      </w:r>
+      <w:r>
+        <w:rPr>
+          <w:lang w:bidi="fa-IR"/>
+        </w:rPr>
+        <w:t xml:space="preserve"> -&gt; Taha</w:t>
+      </w:r>
+    </w:p>
+    <w:p>
+      <w:pPr>
+        <w:pStyle w:val="ListParagraph"/>
+        <w:numPr>
+          <w:ilvl w:val="1"/>
+          <w:numId w:val="10"/>
+        </w:numPr>
+      </w:pPr>
+      <w:r>
+        <w:rPr>
+          <w:lang w:bidi="fa-IR"/>
+        </w:rPr>
+        <w:t>Edit contributed cafes</w:t>
+      </w:r>
+      <w:r>
+        <w:rPr>
+          <w:lang w:bidi="fa-IR"/>
+        </w:rPr>
+        <w:t xml:space="preserve"> -&gt; Dina</w:t>
+      </w:r>
+    </w:p>
+    <w:p>
+      <w:pPr>
+        <w:pStyle w:val="ListParagraph"/>
+        <w:numPr>
+          <w:ilvl w:val="1"/>
+          <w:numId w:val="10"/>
+        </w:numPr>
+      </w:pPr>
+      <w:r>
+        <w:rPr>
+          <w:lang w:bidi="fa-IR"/>
+        </w:rPr>
+        <w:t xml:space="preserve">Scroll to saved cafes if we click on </w:t>
+      </w:r>
+      <w:proofErr w:type="gramStart"/>
+      <w:r>
+        <w:rPr>
+          <w:lang w:bidi="fa-IR"/>
+        </w:rPr>
+        <w:t>the my</w:t>
+      </w:r>
+      <w:proofErr w:type="gramEnd"/>
+      <w:r>
+        <w:rPr>
+          <w:lang w:bidi="fa-IR"/>
+        </w:rPr>
+        <w:t xml:space="preserve"> saved </w:t>
+      </w:r>
+      <w:proofErr w:type="gramStart"/>
+      <w:r>
+        <w:rPr>
+          <w:lang w:bidi="fa-IR"/>
+        </w:rPr>
+        <w:t>cafes(</w:t>
+      </w:r>
+      <w:proofErr w:type="gramEnd"/>
+      <w:r>
+        <w:rPr>
+          <w:lang w:bidi="fa-IR"/>
+        </w:rPr>
+        <w:t>add a page)</w:t>
+      </w:r>
+      <w:r>
+        <w:rPr>
+          <w:lang w:bidi="fa-IR"/>
+        </w:rPr>
+        <w:t xml:space="preserve"> -&gt; Dina</w:t>
+      </w:r>
+    </w:p>
+    <w:p>
+      <w:pPr>
+        <w:pStyle w:val="ListParagraph"/>
+        <w:ind w:left="1440"/>
+      </w:pPr>
+    </w:p>
+    <w:p>
+      <w:pPr>
+        <w:rPr>
+          <w:b/>
+          <w:bCs/>
+          <w:i/>
+          <w:iCs/>
+          <w:sz w:val="36"/>
+          <w:szCs w:val="34"/>
+        </w:rPr>
+      </w:pPr>
+      <w:r>
+        <w:rPr>
+          <w:b/>
+          <w:bCs/>
+          <w:i/>
+          <w:iCs/>
+          <w:sz w:val="36"/>
+          <w:szCs w:val="34"/>
+        </w:rPr>
+        <w:t>Connect them Together!</w:t>
+      </w:r>
     </w:p>
     <w:sectPr>
       <w:pgSz w:w="11906" w:h="16838" w:code="9"/>
@@ -1043,6 +1871,184 @@
     </w:lvl>
   </w:abstractNum>
   <w:abstractNum w:abstractNumId="2" w15:restartNumberingAfterBreak="0">
+    <w:nsid w:val="27E24B0D"/>
+    <w:multiLevelType w:val="hybridMultilevel"/>
+    <w:tmpl w:val="59CEBEC2"/>
+    <w:lvl w:ilvl="0" w:tplc="0409000F">
+      <w:start w:val="1"/>
+      <w:numFmt w:val="decimal"/>
+      <w:lvlText w:val="%1."/>
+      <w:lvlJc w:val="left"/>
+      <w:pPr>
+        <w:ind w:left="720" w:hanging="360"/>
+      </w:pPr>
+      <w:rPr>
+        <w:rFonts w:hint="default"/>
+      </w:rPr>
+    </w:lvl>
+    <w:lvl w:ilvl="1" w:tplc="04090019">
+      <w:start w:val="1"/>
+      <w:numFmt w:val="lowerLetter"/>
+      <w:lvlText w:val="%2."/>
+      <w:lvlJc w:val="left"/>
+      <w:pPr>
+        <w:ind w:left="1440" w:hanging="360"/>
+      </w:pPr>
+    </w:lvl>
+    <w:lvl w:ilvl="2" w:tplc="0409001B" w:tentative="1">
+      <w:start w:val="1"/>
+      <w:numFmt w:val="lowerRoman"/>
+      <w:lvlText w:val="%3."/>
+      <w:lvlJc w:val="right"/>
+      <w:pPr>
+        <w:ind w:left="2160" w:hanging="180"/>
+      </w:pPr>
+    </w:lvl>
+    <w:lvl w:ilvl="3" w:tplc="0409000F" w:tentative="1">
+      <w:start w:val="1"/>
+      <w:numFmt w:val="decimal"/>
+      <w:lvlText w:val="%4."/>
+      <w:lvlJc w:val="left"/>
+      <w:pPr>
+        <w:ind w:left="2880" w:hanging="360"/>
+      </w:pPr>
+    </w:lvl>
+    <w:lvl w:ilvl="4" w:tplc="04090019" w:tentative="1">
+      <w:start w:val="1"/>
+      <w:numFmt w:val="lowerLetter"/>
+      <w:lvlText w:val="%5."/>
+      <w:lvlJc w:val="left"/>
+      <w:pPr>
+        <w:ind w:left="3600" w:hanging="360"/>
+      </w:pPr>
+    </w:lvl>
+    <w:lvl w:ilvl="5" w:tplc="0409001B" w:tentative="1">
+      <w:start w:val="1"/>
+      <w:numFmt w:val="lowerRoman"/>
+      <w:lvlText w:val="%6."/>
+      <w:lvlJc w:val="right"/>
+      <w:pPr>
+        <w:ind w:left="4320" w:hanging="180"/>
+      </w:pPr>
+    </w:lvl>
+    <w:lvl w:ilvl="6" w:tplc="0409000F" w:tentative="1">
+      <w:start w:val="1"/>
+      <w:numFmt w:val="decimal"/>
+      <w:lvlText w:val="%7."/>
+      <w:lvlJc w:val="left"/>
+      <w:pPr>
+        <w:ind w:left="5040" w:hanging="360"/>
+      </w:pPr>
+    </w:lvl>
+    <w:lvl w:ilvl="7" w:tplc="04090019" w:tentative="1">
+      <w:start w:val="1"/>
+      <w:numFmt w:val="lowerLetter"/>
+      <w:lvlText w:val="%8."/>
+      <w:lvlJc w:val="left"/>
+      <w:pPr>
+        <w:ind w:left="5760" w:hanging="360"/>
+      </w:pPr>
+    </w:lvl>
+    <w:lvl w:ilvl="8" w:tplc="0409001B" w:tentative="1">
+      <w:start w:val="1"/>
+      <w:numFmt w:val="lowerRoman"/>
+      <w:lvlText w:val="%9."/>
+      <w:lvlJc w:val="right"/>
+      <w:pPr>
+        <w:ind w:left="6480" w:hanging="180"/>
+      </w:pPr>
+    </w:lvl>
+  </w:abstractNum>
+  <w:abstractNum w:abstractNumId="3" w15:restartNumberingAfterBreak="0">
+    <w:nsid w:val="448028F1"/>
+    <w:multiLevelType w:val="hybridMultilevel"/>
+    <w:tmpl w:val="FB0C925A"/>
+    <w:lvl w:ilvl="0" w:tplc="0409000F">
+      <w:start w:val="1"/>
+      <w:numFmt w:val="decimal"/>
+      <w:lvlText w:val="%1."/>
+      <w:lvlJc w:val="left"/>
+      <w:pPr>
+        <w:ind w:left="720" w:hanging="360"/>
+      </w:pPr>
+      <w:rPr>
+        <w:rFonts w:hint="default"/>
+      </w:rPr>
+    </w:lvl>
+    <w:lvl w:ilvl="1" w:tplc="04090019">
+      <w:start w:val="1"/>
+      <w:numFmt w:val="lowerLetter"/>
+      <w:lvlText w:val="%2."/>
+      <w:lvlJc w:val="left"/>
+      <w:pPr>
+        <w:ind w:left="1440" w:hanging="360"/>
+      </w:pPr>
+    </w:lvl>
+    <w:lvl w:ilvl="2" w:tplc="0409001B" w:tentative="1">
+      <w:start w:val="1"/>
+      <w:numFmt w:val="lowerRoman"/>
+      <w:lvlText w:val="%3."/>
+      <w:lvlJc w:val="right"/>
+      <w:pPr>
+        <w:ind w:left="2160" w:hanging="180"/>
+      </w:pPr>
+    </w:lvl>
+    <w:lvl w:ilvl="3" w:tplc="0409000F" w:tentative="1">
+      <w:start w:val="1"/>
+      <w:numFmt w:val="decimal"/>
+      <w:lvlText w:val="%4."/>
+      <w:lvlJc w:val="left"/>
+      <w:pPr>
+        <w:ind w:left="2880" w:hanging="360"/>
+      </w:pPr>
+    </w:lvl>
+    <w:lvl w:ilvl="4" w:tplc="04090019" w:tentative="1">
+      <w:start w:val="1"/>
+      <w:numFmt w:val="lowerLetter"/>
+      <w:lvlText w:val="%5."/>
+      <w:lvlJc w:val="left"/>
+      <w:pPr>
+        <w:ind w:left="3600" w:hanging="360"/>
+      </w:pPr>
+    </w:lvl>
+    <w:lvl w:ilvl="5" w:tplc="0409001B" w:tentative="1">
+      <w:start w:val="1"/>
+      <w:numFmt w:val="lowerRoman"/>
+      <w:lvlText w:val="%6."/>
+      <w:lvlJc w:val="right"/>
+      <w:pPr>
+        <w:ind w:left="4320" w:hanging="180"/>
+      </w:pPr>
+    </w:lvl>
+    <w:lvl w:ilvl="6" w:tplc="0409000F" w:tentative="1">
+      <w:start w:val="1"/>
+      <w:numFmt w:val="decimal"/>
+      <w:lvlText w:val="%7."/>
+      <w:lvlJc w:val="left"/>
+      <w:pPr>
+        <w:ind w:left="5040" w:hanging="360"/>
+      </w:pPr>
+    </w:lvl>
+    <w:lvl w:ilvl="7" w:tplc="04090019" w:tentative="1">
+      <w:start w:val="1"/>
+      <w:numFmt w:val="lowerLetter"/>
+      <w:lvlText w:val="%8."/>
+      <w:lvlJc w:val="left"/>
+      <w:pPr>
+        <w:ind w:left="5760" w:hanging="360"/>
+      </w:pPr>
+    </w:lvl>
+    <w:lvl w:ilvl="8" w:tplc="0409001B" w:tentative="1">
+      <w:start w:val="1"/>
+      <w:numFmt w:val="lowerRoman"/>
+      <w:lvlText w:val="%9."/>
+      <w:lvlJc w:val="right"/>
+      <w:pPr>
+        <w:ind w:left="6480" w:hanging="180"/>
+      </w:pPr>
+    </w:lvl>
+  </w:abstractNum>
+  <w:abstractNum w:abstractNumId="4" w15:restartNumberingAfterBreak="0">
     <w:nsid w:val="45120EF5"/>
     <w:multiLevelType w:val="hybridMultilevel"/>
     <w:tmpl w:val="3DD21D2A"/>
@@ -1157,7 +2163,7 @@
       </w:rPr>
     </w:lvl>
   </w:abstractNum>
-  <w:abstractNum w:abstractNumId="3" w15:restartNumberingAfterBreak="0">
+  <w:abstractNum w:abstractNumId="5" w15:restartNumberingAfterBreak="0">
     <w:nsid w:val="45C26C38"/>
     <w:multiLevelType w:val="multilevel"/>
     <w:tmpl w:val="ED20824A"/>
@@ -1276,7 +2282,7 @@
       </w:rPr>
     </w:lvl>
   </w:abstractNum>
-  <w:abstractNum w:abstractNumId="4" w15:restartNumberingAfterBreak="0">
+  <w:abstractNum w:abstractNumId="6" w15:restartNumberingAfterBreak="0">
     <w:nsid w:val="4D700FF6"/>
     <w:multiLevelType w:val="multilevel"/>
     <w:tmpl w:val="ED20824A"/>
@@ -1395,7 +2401,7 @@
       </w:rPr>
     </w:lvl>
   </w:abstractNum>
-  <w:abstractNum w:abstractNumId="5" w15:restartNumberingAfterBreak="0">
+  <w:abstractNum w:abstractNumId="7" w15:restartNumberingAfterBreak="0">
     <w:nsid w:val="721E408D"/>
     <w:multiLevelType w:val="multilevel"/>
     <w:tmpl w:val="B1EE7104"/>
@@ -1515,7 +2521,7 @@
       </w:rPr>
     </w:lvl>
   </w:abstractNum>
-  <w:abstractNum w:abstractNumId="6" w15:restartNumberingAfterBreak="0">
+  <w:abstractNum w:abstractNumId="8" w15:restartNumberingAfterBreak="0">
     <w:nsid w:val="7E347171"/>
     <w:multiLevelType w:val="hybridMultilevel"/>
     <w:tmpl w:val="7FC422E8"/>
@@ -1604,7 +2610,7 @@
       </w:pPr>
     </w:lvl>
   </w:abstractNum>
-  <w:abstractNum w:abstractNumId="7" w15:restartNumberingAfterBreak="0">
+  <w:abstractNum w:abstractNumId="9" w15:restartNumberingAfterBreak="0">
     <w:nsid w:val="7F8F642A"/>
     <w:multiLevelType w:val="multilevel"/>
     <w:tmpl w:val="0B88CDA0"/>
@@ -1727,7 +2733,7 @@
     <w:abstractNumId w:val="0"/>
   </w:num>
   <w:num w:numId="2" w16cid:durableId="1056440804">
-    <w:abstractNumId w:val="4"/>
+    <w:abstractNumId w:val="6"/>
     <w:lvlOverride w:ilvl="0">
       <w:lvl w:ilvl="0">
         <w:start w:val="1"/>
@@ -1862,22 +2868,28 @@
     </w:lvlOverride>
   </w:num>
   <w:num w:numId="3" w16cid:durableId="1304117526">
-    <w:abstractNumId w:val="2"/>
+    <w:abstractNumId w:val="4"/>
   </w:num>
   <w:num w:numId="4" w16cid:durableId="880822937">
-    <w:abstractNumId w:val="5"/>
+    <w:abstractNumId w:val="7"/>
   </w:num>
   <w:num w:numId="5" w16cid:durableId="1559705741">
-    <w:abstractNumId w:val="7"/>
+    <w:abstractNumId w:val="9"/>
   </w:num>
   <w:num w:numId="6" w16cid:durableId="1751345362">
-    <w:abstractNumId w:val="3"/>
+    <w:abstractNumId w:val="5"/>
   </w:num>
   <w:num w:numId="7" w16cid:durableId="1711110811">
     <w:abstractNumId w:val="1"/>
   </w:num>
   <w:num w:numId="8" w16cid:durableId="262618347">
-    <w:abstractNumId w:val="6"/>
+    <w:abstractNumId w:val="8"/>
+  </w:num>
+  <w:num w:numId="9" w16cid:durableId="56828010">
+    <w:abstractNumId w:val="2"/>
+  </w:num>
+  <w:num w:numId="10" w16cid:durableId="284851778">
+    <w:abstractNumId w:val="3"/>
   </w:num>
   <w:numIdMacAtCleanup w:val="8"/>
 </w:numbering>
@@ -4194,6 +5206,26 @@
 </file>
 
 <file path=customXml/item1.xml><?xml version="1.0" encoding="utf-8"?>
+<p:properties xmlns:p="http://schemas.microsoft.com/office/2006/metadata/properties" xmlns:xsi="http://www.w3.org/2001/XMLSchema-instance" xmlns:pc="http://schemas.microsoft.com/office/infopath/2007/PartnerControls">
+  <documentManagement>
+    <lcf76f155ced4ddcb4097134ff3c332f xmlns="93f0920f-e512-429f-a063-bed8706918ef">
+      <Terms xmlns="http://schemas.microsoft.com/office/infopath/2007/PartnerControls"/>
+    </lcf76f155ced4ddcb4097134ff3c332f>
+    <TaxCatchAll xmlns="b845ba8c-6b7b-4e80-ad78-584f060a4e44" xsi:nil="true"/>
+  </documentManagement>
+</p:properties>
+</file>
+
+<file path=customXml/item2.xml><?xml version="1.0" encoding="utf-8"?>
+<?mso-contentType ?>
+<FormTemplates xmlns="http://schemas.microsoft.com/sharepoint/v3/contenttype/forms">
+  <Display>DocumentLibraryForm</Display>
+  <Edit>DocumentLibraryForm</Edit>
+  <New>DocumentLibraryForm</New>
+</FormTemplates>
+</file>
+
+<file path=customXml/item3.xml><?xml version="1.0" encoding="utf-8"?>
 <ct:contentTypeSchema xmlns:ct="http://schemas.microsoft.com/office/2006/metadata/contentType" xmlns:ma="http://schemas.microsoft.com/office/2006/metadata/properties/metaAttributes" ct:_="" ma:_="" ma:contentTypeName="Document" ma:contentTypeID="0x010100B44629674731AD4788663E9B5F6A8006" ma:contentTypeVersion="17" ma:contentTypeDescription="Create a new document." ma:contentTypeScope="" ma:versionID="edfdb7c43e047f276c1f37b1bc2f04e9">
   <xsd:schema xmlns:xsd="http://www.w3.org/2001/XMLSchema" xmlns:xs="http://www.w3.org/2001/XMLSchema" xmlns:p="http://schemas.microsoft.com/office/2006/metadata/properties" xmlns:ns2="93f0920f-e512-429f-a063-bed8706918ef" xmlns:ns3="b845ba8c-6b7b-4e80-ad78-584f060a4e44" targetNamespace="http://schemas.microsoft.com/office/2006/metadata/properties" ma:root="true" ma:fieldsID="a3b79598c0a992f7f34d273e82fb2208" ns2:_="" ns3:_="">
     <xsd:import namespace="93f0920f-e512-429f-a063-bed8706918ef"/>
@@ -4442,31 +5474,30 @@
 </ct:contentTypeSchema>
 </file>
 
-<file path=customXml/item2.xml><?xml version="1.0" encoding="utf-8"?>
-<?mso-contentType ?>
-<FormTemplates xmlns="http://schemas.microsoft.com/sharepoint/v3/contenttype/forms">
-  <Display>DocumentLibraryForm</Display>
-  <Edit>DocumentLibraryForm</Edit>
-  <New>DocumentLibraryForm</New>
-</FormTemplates>
-</file>
-
-<file path=customXml/item3.xml><?xml version="1.0" encoding="utf-8"?>
-<p:properties xmlns:p="http://schemas.microsoft.com/office/2006/metadata/properties" xmlns:xsi="http://www.w3.org/2001/XMLSchema-instance" xmlns:pc="http://schemas.microsoft.com/office/infopath/2007/PartnerControls">
-  <documentManagement>
-    <lcf76f155ced4ddcb4097134ff3c332f xmlns="93f0920f-e512-429f-a063-bed8706918ef">
-      <Terms xmlns="http://schemas.microsoft.com/office/infopath/2007/PartnerControls"/>
-    </lcf76f155ced4ddcb4097134ff3c332f>
-    <TaxCatchAll xmlns="b845ba8c-6b7b-4e80-ad78-584f060a4e44" xsi:nil="true"/>
-  </documentManagement>
-</p:properties>
-</file>
-
 <file path=customXml/item4.xml><?xml version="1.0" encoding="utf-8"?>
 <b:Sources xmlns:b="http://schemas.openxmlformats.org/officeDocument/2006/bibliography" xmlns="http://schemas.openxmlformats.org/officeDocument/2006/bibliography" SelectedStyle="\APASixthEditionOfficeOnline.xsl" StyleName="APA" Version="6"/>
 </file>
 
 <file path=customXml/itemProps1.xml><?xml version="1.0" encoding="utf-8"?>
+<ds:datastoreItem xmlns:ds="http://schemas.openxmlformats.org/officeDocument/2006/customXml" ds:itemID="{4BB7D2D4-DF4B-4119-B7DB-7E54DC83A2D5}">
+  <ds:schemaRefs>
+    <ds:schemaRef ds:uri="http://schemas.microsoft.com/office/2006/metadata/properties"/>
+    <ds:schemaRef ds:uri="http://schemas.microsoft.com/office/infopath/2007/PartnerControls"/>
+    <ds:schemaRef ds:uri="93f0920f-e512-429f-a063-bed8706918ef"/>
+    <ds:schemaRef ds:uri="b845ba8c-6b7b-4e80-ad78-584f060a4e44"/>
+  </ds:schemaRefs>
+</ds:datastoreItem>
+</file>
+
+<file path=customXml/itemProps2.xml><?xml version="1.0" encoding="utf-8"?>
+<ds:datastoreItem xmlns:ds="http://schemas.openxmlformats.org/officeDocument/2006/customXml" ds:itemID="{37123298-E796-46ED-AE7D-BEB55E4AF756}">
+  <ds:schemaRefs>
+    <ds:schemaRef ds:uri="http://schemas.microsoft.com/sharepoint/v3/contenttype/forms"/>
+  </ds:schemaRefs>
+</ds:datastoreItem>
+</file>
+
+<file path=customXml/itemProps3.xml><?xml version="1.0" encoding="utf-8"?>
 <ds:datastoreItem xmlns:ds="http://schemas.openxmlformats.org/officeDocument/2006/customXml" ds:itemID="{D7B74BC9-60EC-4DB5-B50E-D02D4FF7B2FA}">
   <ds:schemaRefs>
     <ds:schemaRef ds:uri="http://schemas.microsoft.com/office/2006/metadata/contentType"/>
@@ -4485,25 +5516,6 @@
 </ds:datastoreItem>
 </file>
 
-<file path=customXml/itemProps2.xml><?xml version="1.0" encoding="utf-8"?>
-<ds:datastoreItem xmlns:ds="http://schemas.openxmlformats.org/officeDocument/2006/customXml" ds:itemID="{37123298-E796-46ED-AE7D-BEB55E4AF756}">
-  <ds:schemaRefs>
-    <ds:schemaRef ds:uri="http://schemas.microsoft.com/sharepoint/v3/contenttype/forms"/>
-  </ds:schemaRefs>
-</ds:datastoreItem>
-</file>
-
-<file path=customXml/itemProps3.xml><?xml version="1.0" encoding="utf-8"?>
-<ds:datastoreItem xmlns:ds="http://schemas.openxmlformats.org/officeDocument/2006/customXml" ds:itemID="{4BB7D2D4-DF4B-4119-B7DB-7E54DC83A2D5}">
-  <ds:schemaRefs>
-    <ds:schemaRef ds:uri="http://schemas.microsoft.com/office/2006/metadata/properties"/>
-    <ds:schemaRef ds:uri="http://schemas.microsoft.com/office/infopath/2007/PartnerControls"/>
-    <ds:schemaRef ds:uri="93f0920f-e512-429f-a063-bed8706918ef"/>
-    <ds:schemaRef ds:uri="b845ba8c-6b7b-4e80-ad78-584f060a4e44"/>
-  </ds:schemaRefs>
-</ds:datastoreItem>
-</file>
-
 <file path=customXml/itemProps4.xml><?xml version="1.0" encoding="utf-8"?>
 <ds:datastoreItem xmlns:ds="http://schemas.openxmlformats.org/officeDocument/2006/customXml" ds:itemID="{E3F6B86B-7478-4940-9D0E-409AD3099014}">
   <ds:schemaRefs>

</xml_diff>

<commit_message>
some point s of ToDo list have done
</commit_message>
<xml_diff>
--- a/documentation/Web Project 2.docx
+++ b/documentation/Web Project 2.docx
@@ -1310,6 +1310,22 @@
       <w:r>
         <w:t xml:space="preserve"> -&gt; Dina</w:t>
       </w:r>
+      <w:r>
+        <w:rPr>
+          <w:rFonts w:hint="cs"/>
+          <w:rtl/>
+        </w:rPr>
+        <w:t xml:space="preserve"> </w:t>
+      </w:r>
+      <w:r>
+        <w:rPr>
+          <w:rFonts w:ascii="Wingdings" w:hAnsi="Wingdings" w:cs="Apple Color Emoji"/>
+          <w:color w:val="00B050"/>
+          <w:sz w:val="26"/>
+          <w:szCs w:val="26"/>
+        </w:rPr>
+        <w:t>ü</w:t>
+      </w:r>
     </w:p>
     <w:p>
       <w:pPr>
@@ -1323,7 +1339,13 @@
         <w:t>Add some pictures</w:t>
       </w:r>
       <w:r>
-        <w:t xml:space="preserve"> -&gt; Dina</w:t>
+        <w:t xml:space="preserve"> -&gt; Din</w:t>
+      </w:r>
+      <w:r>
+        <w:rPr>
+          <w:lang w:val="de-DE"/>
+        </w:rPr>
+        <w:t>a</w:t>
       </w:r>
     </w:p>
     <w:p>
@@ -1358,6 +1380,18 @@
       <w:r>
         <w:t xml:space="preserve"> -&gt; Dina</w:t>
       </w:r>
+      <w:r>
+        <w:t xml:space="preserve"> </w:t>
+      </w:r>
+      <w:r>
+        <w:rPr>
+          <w:rFonts w:ascii="Wingdings" w:hAnsi="Wingdings" w:cs="Apple Color Emoji"/>
+          <w:color w:val="00B050"/>
+          <w:sz w:val="26"/>
+          <w:szCs w:val="26"/>
+        </w:rPr>
+        <w:t>ü</w:t>
+      </w:r>
     </w:p>
     <w:p>
       <w:pPr>
@@ -1444,6 +1478,21 @@
         </w:rPr>
         <w:t>(name) -&gt; Dina</w:t>
       </w:r>
+      <w:r>
+        <w:rPr>
+          <w:lang w:bidi="fa-IR"/>
+        </w:rPr>
+        <w:t xml:space="preserve"> </w:t>
+      </w:r>
+      <w:r>
+        <w:rPr>
+          <w:rFonts w:ascii="Wingdings" w:hAnsi="Wingdings" w:cs="Apple Color Emoji"/>
+          <w:color w:val="00B050"/>
+          <w:sz w:val="26"/>
+          <w:szCs w:val="26"/>
+        </w:rPr>
+        <w:t>ü</w:t>
+      </w:r>
     </w:p>
     <w:p>
       <w:pPr>
@@ -1465,6 +1514,21 @@
         </w:rPr>
         <w:t xml:space="preserve"> -&gt; Dina</w:t>
       </w:r>
+      <w:r>
+        <w:rPr>
+          <w:lang w:bidi="fa-IR"/>
+        </w:rPr>
+        <w:t xml:space="preserve"> </w:t>
+      </w:r>
+      <w:r>
+        <w:rPr>
+          <w:rFonts w:ascii="Wingdings" w:hAnsi="Wingdings" w:cs="Apple Color Emoji"/>
+          <w:color w:val="00B050"/>
+          <w:sz w:val="26"/>
+          <w:szCs w:val="26"/>
+        </w:rPr>
+        <w:t>ü</w:t>
+      </w:r>
     </w:p>
     <w:p>
       <w:pPr>
@@ -1511,33 +1575,36 @@
         <w:rPr>
           <w:lang w:bidi="fa-IR"/>
         </w:rPr>
-        <w:t xml:space="preserve"> </w:t>
-      </w:r>
+        <w:t xml:space="preserve"> (templates in the home </w:t>
+      </w:r>
+      <w:proofErr w:type="gramStart"/>
       <w:r>
         <w:rPr>
           <w:lang w:bidi="fa-IR"/>
         </w:rPr>
-        <w:t xml:space="preserve">(templates in the home </w:t>
-      </w:r>
-      <w:proofErr w:type="gramStart"/>
+        <w:t>page)  -</w:t>
+      </w:r>
+      <w:proofErr w:type="gramEnd"/>
       <w:r>
         <w:rPr>
           <w:lang w:bidi="fa-IR"/>
         </w:rPr>
-        <w:t xml:space="preserve">page) </w:t>
+        <w:t xml:space="preserve">&gt; </w:t>
       </w:r>
       <w:r>
         <w:rPr>
           <w:lang w:bidi="fa-IR"/>
         </w:rPr>
-        <w:t xml:space="preserve"> -</w:t>
-      </w:r>
-      <w:proofErr w:type="gramEnd"/>
-      <w:r>
-        <w:rPr>
-          <w:lang w:bidi="fa-IR"/>
-        </w:rPr>
-        <w:t>&gt; Taha</w:t>
+        <w:t xml:space="preserve">Dina </w:t>
+      </w:r>
+      <w:r>
+        <w:rPr>
+          <w:rFonts w:ascii="Wingdings" w:hAnsi="Wingdings" w:cs="Apple Color Emoji"/>
+          <w:color w:val="00B050"/>
+          <w:sz w:val="26"/>
+          <w:szCs w:val="26"/>
+        </w:rPr>
+        <w:t>ü</w:t>
       </w:r>
     </w:p>
     <w:p>
@@ -1573,6 +1640,21 @@
           <w:lang w:bidi="fa-IR"/>
         </w:rPr>
         <w:t>templates in the home page) -&gt; Dina</w:t>
+      </w:r>
+      <w:r>
+        <w:rPr>
+          <w:lang w:bidi="fa-IR"/>
+        </w:rPr>
+        <w:t xml:space="preserve"> </w:t>
+      </w:r>
+      <w:r>
+        <w:rPr>
+          <w:rFonts w:ascii="Wingdings" w:hAnsi="Wingdings" w:cs="Apple Color Emoji"/>
+          <w:color w:val="00B050"/>
+          <w:sz w:val="26"/>
+          <w:szCs w:val="26"/>
+        </w:rPr>
+        <w:t>ü</w:t>
       </w:r>
     </w:p>
     <w:p>
@@ -5206,6 +5288,15 @@
 </file>
 
 <file path=customXml/item1.xml><?xml version="1.0" encoding="utf-8"?>
+<?mso-contentType ?>
+<FormTemplates xmlns="http://schemas.microsoft.com/sharepoint/v3/contenttype/forms">
+  <Display>DocumentLibraryForm</Display>
+  <Edit>DocumentLibraryForm</Edit>
+  <New>DocumentLibraryForm</New>
+</FormTemplates>
+</file>
+
+<file path=customXml/item2.xml><?xml version="1.0" encoding="utf-8"?>
 <p:properties xmlns:p="http://schemas.microsoft.com/office/2006/metadata/properties" xmlns:xsi="http://www.w3.org/2001/XMLSchema-instance" xmlns:pc="http://schemas.microsoft.com/office/infopath/2007/PartnerControls">
   <documentManagement>
     <lcf76f155ced4ddcb4097134ff3c332f xmlns="93f0920f-e512-429f-a063-bed8706918ef">
@@ -5216,16 +5307,11 @@
 </p:properties>
 </file>
 
-<file path=customXml/item2.xml><?xml version="1.0" encoding="utf-8"?>
-<?mso-contentType ?>
-<FormTemplates xmlns="http://schemas.microsoft.com/sharepoint/v3/contenttype/forms">
-  <Display>DocumentLibraryForm</Display>
-  <Edit>DocumentLibraryForm</Edit>
-  <New>DocumentLibraryForm</New>
-</FormTemplates>
+<file path=customXml/item3.xml><?xml version="1.0" encoding="utf-8"?>
+<b:Sources xmlns:b="http://schemas.openxmlformats.org/officeDocument/2006/bibliography" xmlns="http://schemas.openxmlformats.org/officeDocument/2006/bibliography" SelectedStyle="\APASixthEditionOfficeOnline.xsl" StyleName="APA" Version="6"/>
 </file>
 
-<file path=customXml/item3.xml><?xml version="1.0" encoding="utf-8"?>
+<file path=customXml/item4.xml><?xml version="1.0" encoding="utf-8"?>
 <ct:contentTypeSchema xmlns:ct="http://schemas.microsoft.com/office/2006/metadata/contentType" xmlns:ma="http://schemas.microsoft.com/office/2006/metadata/properties/metaAttributes" ct:_="" ma:_="" ma:contentTypeName="Document" ma:contentTypeID="0x010100B44629674731AD4788663E9B5F6A8006" ma:contentTypeVersion="17" ma:contentTypeDescription="Create a new document." ma:contentTypeScope="" ma:versionID="edfdb7c43e047f276c1f37b1bc2f04e9">
   <xsd:schema xmlns:xsd="http://www.w3.org/2001/XMLSchema" xmlns:xs="http://www.w3.org/2001/XMLSchema" xmlns:p="http://schemas.microsoft.com/office/2006/metadata/properties" xmlns:ns2="93f0920f-e512-429f-a063-bed8706918ef" xmlns:ns3="b845ba8c-6b7b-4e80-ad78-584f060a4e44" targetNamespace="http://schemas.microsoft.com/office/2006/metadata/properties" ma:root="true" ma:fieldsID="a3b79598c0a992f7f34d273e82fb2208" ns2:_="" ns3:_="">
     <xsd:import namespace="93f0920f-e512-429f-a063-bed8706918ef"/>
@@ -5474,11 +5560,15 @@
 </ct:contentTypeSchema>
 </file>
 
-<file path=customXml/item4.xml><?xml version="1.0" encoding="utf-8"?>
-<b:Sources xmlns:b="http://schemas.openxmlformats.org/officeDocument/2006/bibliography" xmlns="http://schemas.openxmlformats.org/officeDocument/2006/bibliography" SelectedStyle="\APASixthEditionOfficeOnline.xsl" StyleName="APA" Version="6"/>
+<file path=customXml/itemProps1.xml><?xml version="1.0" encoding="utf-8"?>
+<ds:datastoreItem xmlns:ds="http://schemas.openxmlformats.org/officeDocument/2006/customXml" ds:itemID="{37123298-E796-46ED-AE7D-BEB55E4AF756}">
+  <ds:schemaRefs>
+    <ds:schemaRef ds:uri="http://schemas.microsoft.com/sharepoint/v3/contenttype/forms"/>
+  </ds:schemaRefs>
+</ds:datastoreItem>
 </file>
 
-<file path=customXml/itemProps1.xml><?xml version="1.0" encoding="utf-8"?>
+<file path=customXml/itemProps2.xml><?xml version="1.0" encoding="utf-8"?>
 <ds:datastoreItem xmlns:ds="http://schemas.openxmlformats.org/officeDocument/2006/customXml" ds:itemID="{4BB7D2D4-DF4B-4119-B7DB-7E54DC83A2D5}">
   <ds:schemaRefs>
     <ds:schemaRef ds:uri="http://schemas.microsoft.com/office/2006/metadata/properties"/>
@@ -5489,15 +5579,15 @@
 </ds:datastoreItem>
 </file>
 
-<file path=customXml/itemProps2.xml><?xml version="1.0" encoding="utf-8"?>
-<ds:datastoreItem xmlns:ds="http://schemas.openxmlformats.org/officeDocument/2006/customXml" ds:itemID="{37123298-E796-46ED-AE7D-BEB55E4AF756}">
+<file path=customXml/itemProps3.xml><?xml version="1.0" encoding="utf-8"?>
+<ds:datastoreItem xmlns:ds="http://schemas.openxmlformats.org/officeDocument/2006/customXml" ds:itemID="{E3F6B86B-7478-4940-9D0E-409AD3099014}">
   <ds:schemaRefs>
-    <ds:schemaRef ds:uri="http://schemas.microsoft.com/sharepoint/v3/contenttype/forms"/>
+    <ds:schemaRef ds:uri="http://schemas.openxmlformats.org/officeDocument/2006/bibliography"/>
   </ds:schemaRefs>
 </ds:datastoreItem>
 </file>
 
-<file path=customXml/itemProps3.xml><?xml version="1.0" encoding="utf-8"?>
+<file path=customXml/itemProps4.xml><?xml version="1.0" encoding="utf-8"?>
 <ds:datastoreItem xmlns:ds="http://schemas.openxmlformats.org/officeDocument/2006/customXml" ds:itemID="{D7B74BC9-60EC-4DB5-B50E-D02D4FF7B2FA}">
   <ds:schemaRefs>
     <ds:schemaRef ds:uri="http://schemas.microsoft.com/office/2006/metadata/contentType"/>
@@ -5516,14 +5606,6 @@
 </ds:datastoreItem>
 </file>
 
-<file path=customXml/itemProps4.xml><?xml version="1.0" encoding="utf-8"?>
-<ds:datastoreItem xmlns:ds="http://schemas.openxmlformats.org/officeDocument/2006/customXml" ds:itemID="{E3F6B86B-7478-4940-9D0E-409AD3099014}">
-  <ds:schemaRefs>
-    <ds:schemaRef ds:uri="http://schemas.openxmlformats.org/officeDocument/2006/bibliography"/>
-  </ds:schemaRefs>
-</ds:datastoreItem>
-</file>
-
 <file path=docMetadata/LabelInfo.xml><?xml version="1.0" encoding="utf-8"?>
 <clbl:labelList xmlns:clbl="http://schemas.microsoft.com/office/2020/mipLabelMetadata">
   <clbl:label id="{0cf7ac0a-4681-4823-ab0b-04ef02c5f873}" enabled="1" method="Standard" siteId="{42f7676c-f455-423c-82f6-dc2d99791af7}" contentBits="0" removed="0"/>

</xml_diff>